<commit_message>
Post-validation scope: fixed $300 price, split by item
Replace the per-day estimate with a fixed fee at the client's instruction.

- Total: $300 fixed for all three items.
- Split: Item 1 (false-negative correction) $150, Item 2 (503/latency) $90,
  Item 3 (distant-structure advisory) $60 — proportional to relative effort/risk.
- All per-day / day-rate language removed. Sequencing and the "separate from M3,
  done first" recommendation unchanged.
- .docx regenerated, cover note updated.

Co-Authored-By: Claude Sonnet 5 <noreply@anthropic.com>
</commit_message>
<xml_diff>
--- a/docs/ApiSave_Postvalidation_Scope_and_Sequencing.docx
+++ b/docs/ApiSave_Postvalidation_Scope_and_Sequencing.docx
@@ -7,7 +7,7 @@
         <w:pStyle w:val="Title"/>
       </w:pPr>
       <w:r>
-        <w:t xml:space="preserve">ApiSave — Post-Validation Work: Scope, Effort and Sequencing</w:t>
+        <w:t xml:space="preserve">ApiSave — Post-Validation Work: Scope, Price and Sequencing</w:t>
       </w:r>
     </w:p>
     <w:p>
@@ -40,48 +40,250 @@
         <w:pStyle w:val="FirstParagraph"/>
       </w:pPr>
       <w:r>
-        <w:t xml:space="preserve">You have approved the direction for all three post-validation items. This document gives</w:t>
-      </w:r>
-      <w:r>
-        <w:t xml:space="preserve"> </w:t>
-      </w:r>
-      <w:r>
-        <w:t xml:space="preserve">the effort estimate, the recommended sequence, and a recommendation on whether each belongs</w:t>
-      </w:r>
-      <w:r>
-        <w:t xml:space="preserve"> </w:t>
-      </w:r>
-      <w:r>
-        <w:t xml:space="preserve">inside M3.</w:t>
+        <w:t xml:space="preserve">You have approved the direction for all three post-validation items. This document gives the</w:t>
+      </w:r>
+      <w:r>
+        <w:t xml:space="preserve"> </w:t>
+      </w:r>
+      <w:r>
+        <w:t xml:space="preserve">fixed price, the split across the three items, the recommended sequence, and a</w:t>
+      </w:r>
+      <w:r>
+        <w:t xml:space="preserve"> </w:t>
+      </w:r>
+      <w:r>
+        <w:t xml:space="preserve">recommendation on whether each belongs inside M3.</w:t>
       </w:r>
     </w:p>
     <w:p>
       <w:pPr>
         <w:pStyle w:val="BodyText"/>
       </w:pPr>
-      <w:r>
-        <w:t xml:space="preserve">Rate basis:</w:t>
-      </w:r>
-      <w:r>
-        <w:t xml:space="preserve"> </w:t>
-      </w:r>
       <w:r>
         <w:rPr>
           <w:b/>
           <w:bCs/>
         </w:rPr>
-        <w:t xml:space="preserve">$250 / day</w:t>
-      </w:r>
-      <w:r>
-        <w:t xml:space="preserve">, as used elsewhere in this engagement. Dollar figures are derived</w:t>
-      </w:r>
-      <w:r>
-        <w:t xml:space="preserve"> </w:t>
-      </w:r>
-      <w:r>
-        <w:t xml:space="preserve">from the day ranges; the day ranges are the real estimate.</w:t>
-      </w:r>
-    </w:p>
+        <w:t xml:space="preserve">Fixed price for all three items combined: $300</w:t>
+      </w:r>
+      <w:r>
+        <w:t xml:space="preserve">, split as below. This is a fixed fee for</w:t>
+      </w:r>
+      <w:r>
+        <w:t xml:space="preserve"> </w:t>
+      </w:r>
+      <w:r>
+        <w:t xml:space="preserve">the defined scope, not a day-rate estimate.</w:t>
+      </w:r>
+    </w:p>
+    <w:tbl>
+      <w:tblPr>
+        <w:tblStyle w:val="Table"/>
+        <w:tblW w:type="pct" w:w="5000"/>
+        <w:tblLayout w:type="fixed"/>
+        <w:tblLook w:firstRow="1" w:lastRow="0" w:firstColumn="0" w:lastColumn="0" w:noHBand="0" w:noVBand="0" w:val="0020"/>
+      </w:tblPr>
+      <w:tblGrid>
+        <w:gridCol w:w="2640"/>
+        <w:gridCol w:w="2640"/>
+        <w:gridCol w:w="2640"/>
+      </w:tblGrid>
+      <w:tr>
+        <w:trPr>
+          <w:tblHeader w:val="on"/>
+        </w:trPr>
+        <w:tc>
+          <w:tcPr/>
+          <w:p>
+            <w:pPr>
+              <w:pStyle w:val="Compact"/>
+            </w:pPr>
+            <w:r>
+              <w:t xml:space="preserve">Item</w:t>
+            </w:r>
+          </w:p>
+        </w:tc>
+        <w:tc>
+          <w:tcPr/>
+          <w:p>
+            <w:pPr>
+              <w:pStyle w:val="Compact"/>
+            </w:pPr>
+            <w:r>
+              <w:t xml:space="preserve">Scope</w:t>
+            </w:r>
+          </w:p>
+        </w:tc>
+        <w:tc>
+          <w:tcPr/>
+          <w:p>
+            <w:pPr>
+              <w:pStyle w:val="Compact"/>
+            </w:pPr>
+            <w:r>
+              <w:t xml:space="preserve">Price</w:t>
+            </w:r>
+          </w:p>
+        </w:tc>
+      </w:tr>
+      <w:tr>
+        <w:tc>
+          <w:tcPr/>
+          <w:p>
+            <w:pPr>
+              <w:pStyle w:val="Compact"/>
+            </w:pPr>
+            <w:r>
+              <w:t xml:space="preserve">1 — Asian-hornet false-negative correction</w:t>
+            </w:r>
+          </w:p>
+        </w:tc>
+        <w:tc>
+          <w:tcPr/>
+          <w:p>
+            <w:pPr>
+              <w:pStyle w:val="Compact"/>
+            </w:pPr>
+            <w:r>
+              <w:t xml:space="preserve">Prompt + Judge + schema changes, full before/after repeated-sampling regression</w:t>
+            </w:r>
+          </w:p>
+        </w:tc>
+        <w:tc>
+          <w:tcPr/>
+          <w:p>
+            <w:pPr>
+              <w:pStyle w:val="Compact"/>
+            </w:pPr>
+            <w:r>
+              <w:rPr>
+                <w:b/>
+                <w:bCs/>
+              </w:rPr>
+              <w:t xml:space="preserve">$150</w:t>
+            </w:r>
+          </w:p>
+        </w:tc>
+      </w:tr>
+      <w:tr>
+        <w:tc>
+          <w:tcPr/>
+          <w:p>
+            <w:pPr>
+              <w:pStyle w:val="Compact"/>
+            </w:pPr>
+            <w:r>
+              <w:t xml:space="preserve">2 — Gemini 503 handling and latency</w:t>
+            </w:r>
+          </w:p>
+        </w:tc>
+        <w:tc>
+          <w:tcPr/>
+          <w:p>
+            <w:pPr>
+              <w:pStyle w:val="Compact"/>
+            </w:pPr>
+            <w:r>
+              <w:t xml:space="preserve">Stage timing, 5xx retry with backoff + jitter, image downscaling</w:t>
+            </w:r>
+          </w:p>
+        </w:tc>
+        <w:tc>
+          <w:tcPr/>
+          <w:p>
+            <w:pPr>
+              <w:pStyle w:val="Compact"/>
+            </w:pPr>
+            <w:r>
+              <w:rPr>
+                <w:b/>
+                <w:bCs/>
+              </w:rPr>
+              <w:t xml:space="preserve">$90</w:t>
+            </w:r>
+          </w:p>
+        </w:tc>
+      </w:tr>
+      <w:tr>
+        <w:tc>
+          <w:tcPr/>
+          <w:p>
+            <w:pPr>
+              <w:pStyle w:val="Compact"/>
+            </w:pPr>
+            <w:r>
+              <w:t xml:space="preserve">3 — Distant-structure guided retake</w:t>
+            </w:r>
+          </w:p>
+        </w:tc>
+        <w:tc>
+          <w:tcPr/>
+          <w:p>
+            <w:pPr>
+              <w:pStyle w:val="Compact"/>
+            </w:pPr>
+            <w:r>
+              <w:t xml:space="preserve">Schema flag + Judge suggestion + UI</w:t>
+            </w:r>
+          </w:p>
+        </w:tc>
+        <w:tc>
+          <w:tcPr/>
+          <w:p>
+            <w:pPr>
+              <w:pStyle w:val="Compact"/>
+            </w:pPr>
+            <w:r>
+              <w:rPr>
+                <w:b/>
+                <w:bCs/>
+              </w:rPr>
+              <w:t xml:space="preserve">$60</w:t>
+            </w:r>
+          </w:p>
+        </w:tc>
+      </w:tr>
+      <w:tr>
+        <w:tc>
+          <w:tcPr/>
+          <w:p>
+            <w:pPr>
+              <w:pStyle w:val="Compact"/>
+            </w:pPr>
+            <w:r>
+              <w:rPr>
+                <w:b/>
+                <w:bCs/>
+              </w:rPr>
+              <w:t xml:space="preserve">Total</w:t>
+            </w:r>
+          </w:p>
+        </w:tc>
+        <w:tc>
+          <w:tcPr/>
+          <w:p>
+            <w:pPr>
+              <w:pStyle w:val="Compact"/>
+            </w:pPr>
+          </w:p>
+        </w:tc>
+        <w:tc>
+          <w:tcPr/>
+          <w:p>
+            <w:pPr>
+              <w:pStyle w:val="Compact"/>
+            </w:pPr>
+            <w:r>
+              <w:rPr>
+                <w:b/>
+                <w:bCs/>
+              </w:rPr>
+              <w:t xml:space="preserve">$300</w:t>
+            </w:r>
+          </w:p>
+        </w:tc>
+      </w:tr>
+    </w:tbl>
     <w:p>
       <w:r>
         <w:pict>
@@ -90,13 +292,13 @@
       </w:r>
     </w:p>
     <w:bookmarkEnd w:id="9"/>
-    <w:bookmarkStart w:id="10" w:name="Xcfbb4d975d2e4048541ac7c84614256abdd8f20"/>
+    <w:bookmarkStart w:id="10" w:name="Xbe75db959b67e657e61dafe1b6a9849f4f52679"/>
     <w:p>
       <w:pPr>
         <w:pStyle w:val="Heading1"/>
       </w:pPr>
       <w:r>
-        <w:t xml:space="preserve">Item 1 — Asian-hornet false-negative correction</w:t>
+        <w:t xml:space="preserve">Item 1 — Asian-hornet false-negative correction — $150</w:t>
       </w:r>
     </w:p>
     <w:p>
@@ -115,6 +317,18 @@
       </w:r>
       <w:r>
         <w:t xml:space="preserve">detection-logic change (prompt + Judge + observation schema). Target-adjacent.</w:t>
+      </w:r>
+      <w:r>
+        <w:t xml:space="preserve"> </w:t>
+      </w:r>
+      <w:r>
+        <w:t xml:space="preserve">Largest of the three: it carries the full regression obligation and is likely to need</w:t>
+      </w:r>
+      <w:r>
+        <w:t xml:space="preserve"> </w:t>
+      </w:r>
+      <w:r>
+        <w:t xml:space="preserve">several tuning rounds.</w:t>
       </w:r>
     </w:p>
     <w:p>
@@ -483,13 +697,108 @@
           <w:b/>
           <w:bCs/>
         </w:rPr>
-        <w:t xml:space="preserve">Effort: 3–5 days</w:t>
-      </w:r>
-      <w:r>
-        <w:t xml:space="preserve"> </w:t>
-      </w:r>
-      <w:r>
-        <w:t xml:space="preserve">(~$750–$1,250).</w:t>
+        <w:t xml:space="preserve">Deliverable:</w:t>
+      </w:r>
+      <w:r>
+        <w:t xml:space="preserve"> </w:t>
+      </w:r>
+      <w:r>
+        <w:t xml:space="preserve">the modified prompt / Judge / schema, plus a report with raw before/after</w:t>
+      </w:r>
+      <w:r>
+        <w:t xml:space="preserve"> </w:t>
+      </w:r>
+      <w:r>
+        <w:t xml:space="preserve">decision traces for every regression case.</w:t>
+      </w:r>
+    </w:p>
+    <w:p>
+      <w:pPr>
+        <w:pStyle w:val="BodyText"/>
+      </w:pPr>
+      <w:r>
+        <w:rPr>
+          <w:b/>
+          <w:bCs/>
+        </w:rPr>
+        <w:t xml:space="preserve">Inside M3? — No, recommended separate, and done first.</w:t>
+      </w:r>
+      <w:r>
+        <w:t xml:space="preserve"> </w:t>
+      </w:r>
+      <w:r>
+        <w:t xml:space="preserve">M3’s headline metric is the</w:t>
+      </w:r>
+      <w:r>
+        <w:t xml:space="preserve"> </w:t>
+      </w:r>
+      <w:r>
+        <w:t xml:space="preserve">native-valid JSON rate. Changing the prompt and schema mid-M3 makes that number impossible</w:t>
+      </w:r>
+      <w:r>
+        <w:t xml:space="preserve"> </w:t>
+      </w:r>
+      <w:r>
+        <w:t xml:space="preserve">to attribute — the same reason the photo-#10 experiment was scoped outside M3. This work</w:t>
+      </w:r>
+      <w:r>
+        <w:t xml:space="preserve"> </w:t>
+      </w:r>
+      <w:r>
+        <w:t xml:space="preserve">bumps the prompt and schema versions; M3’s atomic protocol bundle then simply references the</w:t>
+      </w:r>
+      <w:r>
+        <w:t xml:space="preserve"> </w:t>
+      </w:r>
+      <w:r>
+        <w:t xml:space="preserve">corrected versions and validates against the corrected baseline.</w:t>
+      </w:r>
+    </w:p>
+    <w:p>
+      <w:r>
+        <w:pict>
+          <v:rect style="width:0;height:1.5pt" o:hralign="center" o:hrstd="t" o:hr="t"/>
+        </w:pict>
+      </w:r>
+    </w:p>
+    <w:bookmarkEnd w:id="10"/>
+    <w:bookmarkStart w:id="11" w:name="Xed00937945500a4fad177300ff9df1150ebb488"/>
+    <w:p>
+      <w:pPr>
+        <w:pStyle w:val="Heading1"/>
+      </w:pPr>
+      <w:r>
+        <w:t xml:space="preserve">Item 2 — Gemini 503 handling and latency — $90</w:t>
+      </w:r>
+    </w:p>
+    <w:p>
+      <w:pPr>
+        <w:pStyle w:val="FirstParagraph"/>
+      </w:pPr>
+      <w:r>
+        <w:rPr>
+          <w:b/>
+          <w:bCs/>
+        </w:rPr>
+        <w:t xml:space="preserve">Nature:</w:t>
+      </w:r>
+      <w:r>
+        <w:t xml:space="preserve"> </w:t>
+      </w:r>
+      <w:r>
+        <w:t xml:space="preserve">transport layer. No detection logic touched.</w:t>
+      </w:r>
+    </w:p>
+    <w:p>
+      <w:pPr>
+        <w:pStyle w:val="BodyText"/>
+      </w:pPr>
+      <w:r>
+        <w:rPr>
+          <w:b/>
+          <w:bCs/>
+        </w:rPr>
+        <w:t xml:space="preserve">Scope:</w:t>
       </w:r>
     </w:p>
     <w:p>
@@ -501,7 +810,13 @@
         </w:numPr>
       </w:pPr>
       <w:r>
-        <w:t xml:space="preserve">~1 day — implement the five changes, synthetic Judge tests.</w:t>
+        <w:t xml:space="preserve">Stage-timing instrumentation — image prep, Gemini call, retries, schema validation, Judge</w:t>
+      </w:r>
+      <w:r>
+        <w:t xml:space="preserve"> </w:t>
+      </w:r>
+      <w:r>
+        <w:t xml:space="preserve">— surfaced in a debug log. (This is also the per-stage measurement you asked for.)</w:t>
       </w:r>
     </w:p>
     <w:p>
@@ -513,13 +828,19 @@
         </w:numPr>
       </w:pPr>
       <w:r>
-        <w:t xml:space="preserve">~1.5–3 days — iterative live regression. Prompt tuning is volatile (M2 took four rounds);</w:t>
-      </w:r>
-      <w:r>
-        <w:t xml:space="preserve"> </w:t>
-      </w:r>
-      <w:r>
-        <w:t xml:space="preserve">the baseline run on day one will show where in this range it lands.</w:t>
+        <w:t xml:space="preserve">Retry policy rework: include 500/502/503/504, exponential backoff with jitter, honour</w:t>
+      </w:r>
+      <w:r>
+        <w:t xml:space="preserve"> </w:t>
+      </w:r>
+      <w:r>
+        <w:rPr>
+          <w:rStyle w:val="VerbatimChar"/>
+        </w:rPr>
+        <w:t xml:space="preserve">Retry-After</w:t>
+      </w:r>
+      <w:r>
+        <w:t xml:space="preserve">, cap the retry budget.</w:t>
       </w:r>
     </w:p>
     <w:p>
@@ -531,19 +852,13 @@
         </w:numPr>
       </w:pPr>
       <w:r>
-        <w:t xml:space="preserve">~0.5–1 day — report with raw decision traces, before/after evidence,</w:t>
-      </w:r>
-      <w:r>
-        <w:t xml:space="preserve"> </w:t>
-      </w:r>
-      <w:r>
-        <w:rPr>
-          <w:rStyle w:val="VerbatimChar"/>
-        </w:rPr>
-        <w:t xml:space="preserve">.docx</w:t>
-      </w:r>
-      <w:r>
-        <w:t xml:space="preserve">.</w:t>
+        <w:t xml:space="preserve">Downscale the image (longest edge ~1024–1568 px) before base64 encoding, so a multi-MB</w:t>
+      </w:r>
+      <w:r>
+        <w:t xml:space="preserve"> </w:t>
+      </w:r>
+      <w:r>
+        <w:t xml:space="preserve">full-resolution photo is not uploaded — and re-uploaded on every retry.</w:t>
       </w:r>
     </w:p>
     <w:p>
@@ -555,59 +870,43 @@
           <w:b/>
           <w:bCs/>
         </w:rPr>
-        <w:t xml:space="preserve">Inside M3? — No, recommended separate.</w:t>
-      </w:r>
-      <w:r>
-        <w:t xml:space="preserve"> </w:t>
-      </w:r>
-      <w:r>
-        <w:t xml:space="preserve">M3’s headline metric is the native-valid JSON</w:t>
-      </w:r>
-      <w:r>
-        <w:t xml:space="preserve"> </w:t>
-      </w:r>
-      <w:r>
-        <w:t xml:space="preserve">rate. Changing the prompt and schema mid-M3 makes that number impossible to attribute — the</w:t>
-      </w:r>
-      <w:r>
-        <w:t xml:space="preserve"> </w:t>
-      </w:r>
-      <w:r>
-        <w:t xml:space="preserve">same reason the photo-#10 experiment was scoped outside M3. Practically, this work bumps the</w:t>
-      </w:r>
-      <w:r>
-        <w:t xml:space="preserve"> </w:t>
-      </w:r>
-      <w:r>
-        <w:t xml:space="preserve">prompt and schema versions, and M3’s atomic protocol bundle then simply references the</w:t>
-      </w:r>
-      <w:r>
-        <w:t xml:space="preserve"> </w:t>
-      </w:r>
-      <w:r>
-        <w:t xml:space="preserve">corrected versions. It should be done</w:t>
-      </w:r>
-      <w:r>
-        <w:t xml:space="preserve"> </w:t>
-      </w:r>
+        <w:t xml:space="preserve">Validation:</w:t>
+      </w:r>
+      <w:r>
+        <w:t xml:space="preserve"> </w:t>
+      </w:r>
+      <w:r>
+        <w:t xml:space="preserve">measured before/after latency on a real device; the M2 reference set re-run</w:t>
+      </w:r>
+      <w:r>
+        <w:t xml:space="preserve"> </w:t>
+      </w:r>
+      <w:r>
+        <w:t xml:space="preserve">at the reduced resolution to confirm no accuracy change from downscaling.</w:t>
+      </w:r>
+    </w:p>
+    <w:p>
+      <w:pPr>
+        <w:pStyle w:val="BodyText"/>
+      </w:pPr>
       <w:r>
         <w:rPr>
           <w:b/>
           <w:bCs/>
         </w:rPr>
-        <w:t xml:space="preserve">before</w:t>
-      </w:r>
-      <w:r>
-        <w:t xml:space="preserve"> </w:t>
-      </w:r>
-      <w:r>
-        <w:t xml:space="preserve">M3 so M3 validates against the corrected</w:t>
-      </w:r>
-      <w:r>
-        <w:t xml:space="preserve"> </w:t>
-      </w:r>
-      <w:r>
-        <w:t xml:space="preserve">baseline.</w:t>
+        <w:t xml:space="preserve">Inside M3? — No, independent.</w:t>
+      </w:r>
+      <w:r>
+        <w:t xml:space="preserve"> </w:t>
+      </w:r>
+      <w:r>
+        <w:t xml:space="preserve">It can run in parallel with Item 1 or immediately after,</w:t>
+      </w:r>
+      <w:r>
+        <w:t xml:space="preserve"> </w:t>
+      </w:r>
+      <w:r>
+        <w:t xml:space="preserve">and gives immediate relief from the 503s being seen now.</w:t>
       </w:r>
     </w:p>
     <w:p>
@@ -617,14 +916,14 @@
         </w:pict>
       </w:r>
     </w:p>
-    <w:bookmarkEnd w:id="10"/>
-    <w:bookmarkStart w:id="11" w:name="item-2-gemini-503-handling-and-latency"/>
+    <w:bookmarkEnd w:id="11"/>
+    <w:bookmarkStart w:id="12" w:name="Xd08696d5d399f1990748ef90d24bf236b2151e1"/>
     <w:p>
       <w:pPr>
         <w:pStyle w:val="Heading1"/>
       </w:pPr>
       <w:r>
-        <w:t xml:space="preserve">Item 2 — Gemini 503 handling and latency</w:t>
+        <w:t xml:space="preserve">Item 3 — Distant-structure guided retake — $60</w:t>
       </w:r>
     </w:p>
     <w:p>
@@ -642,7 +941,13 @@
         <w:t xml:space="preserve"> </w:t>
       </w:r>
       <w:r>
-        <w:t xml:space="preserve">transport layer. No detection logic touched.</w:t>
+        <w:t xml:space="preserve">new advisory feature. No verdict ever changes. Smallest and lowest-risk of the</w:t>
+      </w:r>
+      <w:r>
+        <w:t xml:space="preserve"> </w:t>
+      </w:r>
+      <w:r>
+        <w:t xml:space="preserve">three.</w:t>
       </w:r>
     </w:p>
     <w:p>
@@ -666,13 +971,43 @@
         </w:numPr>
       </w:pPr>
       <w:r>
-        <w:t xml:space="preserve">Stage-timing instrumentation — image prep, Gemini call, retries, schema validation, Judge</w:t>
-      </w:r>
-      <w:r>
-        <w:t xml:space="preserve"> </w:t>
-      </w:r>
-      <w:r>
-        <w:t xml:space="preserve">— surfaced in a debug log. (This is also the per-stage measurement you asked for.)</w:t>
+        <w:t xml:space="preserve">Schema + prompt — add</w:t>
+      </w:r>
+      <w:r>
+        <w:t xml:space="preserve"> </w:t>
+      </w:r>
+      <w:r>
+        <w:rPr>
+          <w:rStyle w:val="VerbatimChar"/>
+        </w:rPr>
+        <w:t xml:space="preserve">structure.trop_distante_pour_evaluer</w:t>
+      </w:r>
+      <w:r>
+        <w:t xml:space="preserve">, set by the model when a</w:t>
+      </w:r>
+      <w:r>
+        <w:t xml:space="preserve"> </w:t>
+      </w:r>
+      <w:r>
+        <w:t xml:space="preserve">structure is visible but too small/far to assess (the model already says</w:t>
+      </w:r>
+      <w:r>
+        <w:t xml:space="preserve"> </w:t>
+      </w:r>
+      <w:r>
+        <w:t xml:space="preserve">“distant”</w:t>
+      </w:r>
+      <w:r>
+        <w:t xml:space="preserve"> </w:t>
+      </w:r>
+      <w:r>
+        <w:t xml:space="preserve">in its</w:t>
+      </w:r>
+      <w:r>
+        <w:t xml:space="preserve"> </w:t>
+      </w:r>
+      <w:r>
+        <w:t xml:space="preserve">free text; this captures it).</w:t>
       </w:r>
     </w:p>
     <w:p>
@@ -684,7 +1019,7 @@
         </w:numPr>
       </w:pPr>
       <w:r>
-        <w:t xml:space="preserve">Retry policy rework: include 500/502/503/504, exponential backoff with jitter, honour</w:t>
+        <w:t xml:space="preserve">Judge — when that flag is set and the structure path resolves to</w:t>
       </w:r>
       <w:r>
         <w:t xml:space="preserve"> </w:t>
@@ -693,10 +1028,55 @@
         <w:rPr>
           <w:rStyle w:val="VerbatimChar"/>
         </w:rPr>
-        <w:t xml:space="preserve">Retry-After</w:t>
-      </w:r>
-      <w:r>
-        <w:t xml:space="preserve">, cap the retry budget.</w:t>
+        <w:t xml:space="preserve">VERT</w:t>
+      </w:r>
+      <w:r>
+        <w:t xml:space="preserve">, attach the</w:t>
+      </w:r>
+      <w:r>
+        <w:t xml:space="preserve"> </w:t>
+      </w:r>
+      <w:r>
+        <w:t xml:space="preserve">suggested wording (</w:t>
+      </w:r>
+      <w:r>
+        <w:t xml:space="preserve">“A distant structure has been detected. Zoom in or take a closer photo</w:t>
+      </w:r>
+      <w:r>
+        <w:t xml:space="preserve"> </w:t>
+      </w:r>
+      <w:r>
+        <w:t xml:space="preserve">for a more precise analysis.”</w:t>
+      </w:r>
+      <w:r>
+        <w:t xml:space="preserve">) without changing</w:t>
+      </w:r>
+      <w:r>
+        <w:t xml:space="preserve"> </w:t>
+      </w:r>
+      <w:r>
+        <w:rPr>
+          <w:rStyle w:val="VerbatimChar"/>
+        </w:rPr>
+        <w:t xml:space="preserve">verdict</w:t>
+      </w:r>
+      <w:r>
+        <w:t xml:space="preserve"> </w:t>
+      </w:r>
+      <w:r>
+        <w:t xml:space="preserve">/</w:t>
+      </w:r>
+      <w:r>
+        <w:t xml:space="preserve"> </w:t>
+      </w:r>
+      <w:r>
+        <w:rPr>
+          <w:rStyle w:val="VerbatimChar"/>
+        </w:rPr>
+        <w:t xml:space="preserve">verdict_code</w:t>
+      </w:r>
+      <w:r>
+        <w:t xml:space="preserve">.</w:t>
       </w:r>
     </w:p>
     <w:p>
@@ -708,13 +1088,7 @@
         </w:numPr>
       </w:pPr>
       <w:r>
-        <w:t xml:space="preserve">Downscale the image (longest edge ~1024–1568 px) before base64 encoding, so a multi-MB</w:t>
-      </w:r>
-      <w:r>
-        <w:t xml:space="preserve"> </w:t>
-      </w:r>
-      <w:r>
-        <w:t xml:space="preserve">full-resolution photo is not uploaded — and re-uploaded on every retry.</w:t>
+        <w:t xml:space="preserve">UI — render the suggestion beneath the green result.</w:t>
       </w:r>
     </w:p>
     <w:p>
@@ -732,13 +1106,37 @@
         <w:t xml:space="preserve"> </w:t>
       </w:r>
       <w:r>
-        <w:t xml:space="preserve">measured before/after latency on a real device; the M2 reference set re-run</w:t>
-      </w:r>
-      <w:r>
-        <w:t xml:space="preserve"> </w:t>
-      </w:r>
-      <w:r>
-        <w:t xml:space="preserve">at the reduced resolution to confirm no accuracy change from downscaling.</w:t>
+        <w:t xml:space="preserve">the flag fires on distant-structure images; zero verdict changes across the</w:t>
+      </w:r>
+      <w:r>
+        <w:t xml:space="preserve"> </w:t>
+      </w:r>
+      <w:r>
+        <w:t xml:space="preserve">existing structure regression set (</w:t>
+      </w:r>
+      <w:r>
+        <w:rPr>
+          <w:rStyle w:val="VerbatimChar"/>
+        </w:rPr>
+        <w:t xml:space="preserve">test_images</w:t>
+      </w:r>
+      <w:r>
+        <w:t xml:space="preserve">,</w:t>
+      </w:r>
+      <w:r>
+        <w:t xml:space="preserve"> </w:t>
+      </w:r>
+      <w:r>
+        <w:rPr>
+          <w:rStyle w:val="VerbatimChar"/>
+        </w:rPr>
+        <w:t xml:space="preserve">test_images_5</w:t>
+      </w:r>
+      <w:r>
+        <w:t xml:space="preserve"> </w:t>
+      </w:r>
+      <w:r>
+        <w:t xml:space="preserve">Case 3).</w:t>
       </w:r>
     </w:p>
     <w:p>
@@ -750,309 +1148,13 @@
           <w:b/>
           <w:bCs/>
         </w:rPr>
-        <w:t xml:space="preserve">Effort: 2–3 days</w:t>
-      </w:r>
-      <w:r>
-        <w:t xml:space="preserve"> </w:t>
-      </w:r>
-      <w:r>
-        <w:t xml:space="preserve">(~$500–$750).</w:t>
-      </w:r>
-    </w:p>
-    <w:p>
-      <w:pPr>
-        <w:pStyle w:val="BodyText"/>
-      </w:pPr>
-      <w:r>
-        <w:rPr>
-          <w:b/>
-          <w:bCs/>
-        </w:rPr>
         <w:t xml:space="preserve">Inside M3? — No, independent.</w:t>
       </w:r>
       <w:r>
         <w:t xml:space="preserve"> </w:t>
       </w:r>
       <w:r>
-        <w:t xml:space="preserve">It can run in parallel with Item 1 or immediately after.</w:t>
-      </w:r>
-      <w:r>
-        <w:t xml:space="preserve"> </w:t>
-      </w:r>
-      <w:r>
-        <w:t xml:space="preserve">It gives the client immediate relief from the 503s being seen now, rather than waiting on</w:t>
-      </w:r>
-      <w:r>
-        <w:t xml:space="preserve"> </w:t>
-      </w:r>
-      <w:r>
-        <w:t xml:space="preserve">M3.</w:t>
-      </w:r>
-    </w:p>
-    <w:p>
-      <w:r>
-        <w:pict>
-          <v:rect style="width:0;height:1.5pt" o:hralign="center" o:hrstd="t" o:hr="t"/>
-        </w:pict>
-      </w:r>
-    </w:p>
-    <w:bookmarkEnd w:id="11"/>
-    <w:bookmarkStart w:id="12" w:name="item-3-distant-structure-guided-retake"/>
-    <w:p>
-      <w:pPr>
-        <w:pStyle w:val="Heading1"/>
-      </w:pPr>
-      <w:r>
-        <w:t xml:space="preserve">Item 3 — Distant-structure guided retake</w:t>
-      </w:r>
-    </w:p>
-    <w:p>
-      <w:pPr>
-        <w:pStyle w:val="FirstParagraph"/>
-      </w:pPr>
-      <w:r>
-        <w:rPr>
-          <w:b/>
-          <w:bCs/>
-        </w:rPr>
-        <w:t xml:space="preserve">Nature:</w:t>
-      </w:r>
-      <w:r>
-        <w:t xml:space="preserve"> </w:t>
-      </w:r>
-      <w:r>
-        <w:t xml:space="preserve">new advisory feature. No verdict ever changes.</w:t>
-      </w:r>
-    </w:p>
-    <w:p>
-      <w:pPr>
-        <w:pStyle w:val="BodyText"/>
-      </w:pPr>
-      <w:r>
-        <w:rPr>
-          <w:b/>
-          <w:bCs/>
-        </w:rPr>
-        <w:t xml:space="preserve">Scope:</w:t>
-      </w:r>
-    </w:p>
-    <w:p>
-      <w:pPr>
-        <w:pStyle w:val="Compact"/>
-        <w:numPr>
-          <w:ilvl w:val="0"/>
-          <w:numId w:val="1004"/>
-        </w:numPr>
-      </w:pPr>
-      <w:r>
-        <w:t xml:space="preserve">Schema + prompt — add</w:t>
-      </w:r>
-      <w:r>
-        <w:t xml:space="preserve"> </w:t>
-      </w:r>
-      <w:r>
-        <w:rPr>
-          <w:rStyle w:val="VerbatimChar"/>
-        </w:rPr>
-        <w:t xml:space="preserve">structure.trop_distante_pour_evaluer</w:t>
-      </w:r>
-      <w:r>
-        <w:t xml:space="preserve">, set by the model when a</w:t>
-      </w:r>
-      <w:r>
-        <w:t xml:space="preserve"> </w:t>
-      </w:r>
-      <w:r>
-        <w:t xml:space="preserve">structure is visible but too small/far to assess (the model already says</w:t>
-      </w:r>
-      <w:r>
-        <w:t xml:space="preserve"> </w:t>
-      </w:r>
-      <w:r>
-        <w:t xml:space="preserve">“distant”</w:t>
-      </w:r>
-      <w:r>
-        <w:t xml:space="preserve"> </w:t>
-      </w:r>
-      <w:r>
-        <w:t xml:space="preserve">in its</w:t>
-      </w:r>
-      <w:r>
-        <w:t xml:space="preserve"> </w:t>
-      </w:r>
-      <w:r>
-        <w:t xml:space="preserve">free text; this captures it).</w:t>
-      </w:r>
-    </w:p>
-    <w:p>
-      <w:pPr>
-        <w:pStyle w:val="Compact"/>
-        <w:numPr>
-          <w:ilvl w:val="0"/>
-          <w:numId w:val="1004"/>
-        </w:numPr>
-      </w:pPr>
-      <w:r>
-        <w:t xml:space="preserve">Judge — when that flag is set and the structure path resolves to</w:t>
-      </w:r>
-      <w:r>
-        <w:t xml:space="preserve"> </w:t>
-      </w:r>
-      <w:r>
-        <w:rPr>
-          <w:rStyle w:val="VerbatimChar"/>
-        </w:rPr>
-        <w:t xml:space="preserve">VERT</w:t>
-      </w:r>
-      <w:r>
-        <w:t xml:space="preserve">, attach the</w:t>
-      </w:r>
-      <w:r>
-        <w:t xml:space="preserve"> </w:t>
-      </w:r>
-      <w:r>
-        <w:t xml:space="preserve">suggested wording (</w:t>
-      </w:r>
-      <w:r>
-        <w:t xml:space="preserve">“A distant structure has been detected. Zoom in or take a closer photo</w:t>
-      </w:r>
-      <w:r>
-        <w:t xml:space="preserve"> </w:t>
-      </w:r>
-      <w:r>
-        <w:t xml:space="preserve">for a more precise analysis.”</w:t>
-      </w:r>
-      <w:r>
-        <w:t xml:space="preserve">) without changing</w:t>
-      </w:r>
-      <w:r>
-        <w:t xml:space="preserve"> </w:t>
-      </w:r>
-      <w:r>
-        <w:rPr>
-          <w:rStyle w:val="VerbatimChar"/>
-        </w:rPr>
-        <w:t xml:space="preserve">verdict</w:t>
-      </w:r>
-      <w:r>
-        <w:t xml:space="preserve"> </w:t>
-      </w:r>
-      <w:r>
-        <w:t xml:space="preserve">/</w:t>
-      </w:r>
-      <w:r>
-        <w:t xml:space="preserve"> </w:t>
-      </w:r>
-      <w:r>
-        <w:rPr>
-          <w:rStyle w:val="VerbatimChar"/>
-        </w:rPr>
-        <w:t xml:space="preserve">verdict_code</w:t>
-      </w:r>
-      <w:r>
-        <w:t xml:space="preserve">.</w:t>
-      </w:r>
-    </w:p>
-    <w:p>
-      <w:pPr>
-        <w:pStyle w:val="Compact"/>
-        <w:numPr>
-          <w:ilvl w:val="0"/>
-          <w:numId w:val="1004"/>
-        </w:numPr>
-      </w:pPr>
-      <w:r>
-        <w:t xml:space="preserve">UI — render the suggestion beneath the green result.</w:t>
-      </w:r>
-    </w:p>
-    <w:p>
-      <w:pPr>
-        <w:pStyle w:val="FirstParagraph"/>
-      </w:pPr>
-      <w:r>
-        <w:rPr>
-          <w:b/>
-          <w:bCs/>
-        </w:rPr>
-        <w:t xml:space="preserve">Validation:</w:t>
-      </w:r>
-      <w:r>
-        <w:t xml:space="preserve"> </w:t>
-      </w:r>
-      <w:r>
-        <w:t xml:space="preserve">the flag fires on distant-structure images; zero verdict changes across the</w:t>
-      </w:r>
-      <w:r>
-        <w:t xml:space="preserve"> </w:t>
-      </w:r>
-      <w:r>
-        <w:t xml:space="preserve">existing structure regression set (</w:t>
-      </w:r>
-      <w:r>
-        <w:rPr>
-          <w:rStyle w:val="VerbatimChar"/>
-        </w:rPr>
-        <w:t xml:space="preserve">test_images</w:t>
-      </w:r>
-      <w:r>
-        <w:t xml:space="preserve">,</w:t>
-      </w:r>
-      <w:r>
-        <w:t xml:space="preserve"> </w:t>
-      </w:r>
-      <w:r>
-        <w:rPr>
-          <w:rStyle w:val="VerbatimChar"/>
-        </w:rPr>
-        <w:t xml:space="preserve">test_images_5</w:t>
-      </w:r>
-      <w:r>
-        <w:t xml:space="preserve"> </w:t>
-      </w:r>
-      <w:r>
-        <w:t xml:space="preserve">Case 3).</w:t>
-      </w:r>
-    </w:p>
-    <w:p>
-      <w:pPr>
-        <w:pStyle w:val="BodyText"/>
-      </w:pPr>
-      <w:r>
-        <w:rPr>
-          <w:b/>
-          <w:bCs/>
-        </w:rPr>
-        <w:t xml:space="preserve">Effort: 1.5–2.5 days</w:t>
-      </w:r>
-      <w:r>
-        <w:t xml:space="preserve"> </w:t>
-      </w:r>
-      <w:r>
-        <w:t xml:space="preserve">(~$375–$625).</w:t>
-      </w:r>
-    </w:p>
-    <w:p>
-      <w:pPr>
-        <w:pStyle w:val="BodyText"/>
-      </w:pPr>
-      <w:r>
-        <w:rPr>
-          <w:b/>
-          <w:bCs/>
-        </w:rPr>
-        <w:t xml:space="preserve">Inside M3? — No, independent.</w:t>
-      </w:r>
-      <w:r>
-        <w:t xml:space="preserve"> </w:t>
-      </w:r>
-      <w:r>
-        <w:t xml:space="preserve">Product feature, unrelated to M3 infrastructure. Lowest</w:t>
-      </w:r>
-      <w:r>
-        <w:t xml:space="preserve"> </w:t>
-      </w:r>
-      <w:r>
-        <w:t xml:space="preserve">risk of the three; can slot in wherever convenient.</w:t>
+        <w:t xml:space="preserve">Product feature, unrelated to M3 infrastructure.</w:t>
       </w:r>
     </w:p>
     <w:p>
@@ -1118,7 +1220,7 @@
               <w:pStyle w:val="Compact"/>
             </w:pPr>
             <w:r>
-              <w:t xml:space="preserve">Days</w:t>
+              <w:t xml:space="preserve">Price</w:t>
             </w:r>
           </w:p>
         </w:tc>
@@ -1174,18 +1276,18 @@
               <w:pStyle w:val="Compact"/>
             </w:pPr>
             <w:r>
-              <w:t xml:space="preserve">3–5</w:t>
-            </w:r>
-          </w:p>
-        </w:tc>
-        <w:tc>
-          <w:tcPr/>
-          <w:p>
-            <w:pPr>
-              <w:pStyle w:val="Compact"/>
-            </w:pPr>
-            <w:r>
-              <w:t xml:space="preserve">Safety-critical (false negative on the target species). Detection baseline must be stable before any further build ships or M3 validates against it.</w:t>
+              <w:t xml:space="preserve">$150</w:t>
+            </w:r>
+          </w:p>
+        </w:tc>
+        <w:tc>
+          <w:tcPr/>
+          <w:p>
+            <w:pPr>
+              <w:pStyle w:val="Compact"/>
+            </w:pPr>
+            <w:r>
+              <w:t xml:space="preserve">Safety-critical (false negative on the target species). The detection baseline must be stable before any further build ships or M3 validates against it.</w:t>
             </w:r>
           </w:p>
         </w:tc>
@@ -1230,7 +1332,7 @@
               <w:pStyle w:val="Compact"/>
             </w:pPr>
             <w:r>
-              <w:t xml:space="preserve">2–3</w:t>
+              <w:t xml:space="preserve">$90</w:t>
             </w:r>
           </w:p>
         </w:tc>
@@ -1286,7 +1388,7 @@
               <w:pStyle w:val="Compact"/>
             </w:pPr>
             <w:r>
-              <w:t xml:space="preserve">1.5–2.5</w:t>
+              <w:t xml:space="preserve">$60</w:t>
             </w:r>
           </w:p>
         </w:tc>
@@ -1358,29 +1460,26 @@
         <w:pStyle w:val="BodyText"/>
       </w:pPr>
       <w:r>
+        <w:t xml:space="preserve">The three items are billed</w:t>
+      </w:r>
+      <w:r>
+        <w:t xml:space="preserve"> </w:t>
+      </w:r>
+      <w:r>
         <w:rPr>
           <w:b/>
           <w:bCs/>
         </w:rPr>
-        <w:t xml:space="preserve">Combined for the three items: 6.5–10.5 days (~$1,625–$2,625).</w:t>
-      </w:r>
-      <w:r>
-        <w:t xml:space="preserve"> </w:t>
-      </w:r>
-      <w:r>
-        <w:t xml:space="preserve">If you would rather treat</w:t>
-      </w:r>
-      <w:r>
-        <w:t xml:space="preserve"> </w:t>
-      </w:r>
-      <w:r>
-        <w:t xml:space="preserve">them as one approval and one invoice rather than three, that is fine — the sequence and</w:t>
-      </w:r>
-      <w:r>
-        <w:t xml:space="preserve"> </w:t>
-      </w:r>
-      <w:r>
-        <w:t xml:space="preserve">totals are unchanged.</w:t>
+        <w:t xml:space="preserve">separately from M3</w:t>
+      </w:r>
+      <w:r>
+        <w:t xml:space="preserve">. If you would rather treat them as one</w:t>
+      </w:r>
+      <w:r>
+        <w:t xml:space="preserve"> </w:t>
+      </w:r>
+      <w:r>
+        <w:t xml:space="preserve">approval and one payment of $300 rather than three, that is fine — the sequence is unchanged.</w:t>
       </w:r>
     </w:p>
     <w:p>
@@ -1405,11 +1504,17 @@
         <w:pStyle w:val="Compact"/>
         <w:numPr>
           <w:ilvl w:val="0"/>
-          <w:numId w:val="1005"/>
+          <w:numId w:val="1004"/>
         </w:numPr>
       </w:pPr>
       <w:r>
-        <w:t xml:space="preserve">Confirm the effort range and sequence above, or tell me what to adjust.</w:t>
+        <w:t xml:space="preserve">Confirm the $300 fixed price, the split, and the sequence above — or tell me what to</w:t>
+      </w:r>
+      <w:r>
+        <w:t xml:space="preserve"> </w:t>
+      </w:r>
+      <w:r>
+        <w:t xml:space="preserve">adjust.</w:t>
       </w:r>
     </w:p>
     <w:p>
@@ -1417,41 +1522,7 @@
         <w:pStyle w:val="Compact"/>
         <w:numPr>
           <w:ilvl w:val="0"/>
-          <w:numId w:val="1005"/>
-        </w:numPr>
-      </w:pPr>
-      <w:r>
-        <w:t xml:space="preserve">Confirm you are happy for the three items to be billed</w:t>
-      </w:r>
-      <w:r>
-        <w:t xml:space="preserve"> </w:t>
-      </w:r>
-      <w:r>
-        <w:rPr>
-          <w:b/>
-          <w:bCs/>
-        </w:rPr>
-        <w:t xml:space="preserve">separately from M3</w:t>
-      </w:r>
-      <w:r>
-        <w:t xml:space="preserve"> </w:t>
-      </w:r>
-      <w:r>
-        <w:t xml:space="preserve">(recommended),</w:t>
-      </w:r>
-      <w:r>
-        <w:t xml:space="preserve"> </w:t>
-      </w:r>
-      <w:r>
-        <w:t xml:space="preserve">or bundled — your call.</w:t>
-      </w:r>
-    </w:p>
-    <w:p>
-      <w:pPr>
-        <w:pStyle w:val="Compact"/>
-        <w:numPr>
-          <w:ilvl w:val="0"/>
-          <w:numId w:val="1005"/>
+          <w:numId w:val="1004"/>
         </w:numPr>
       </w:pPr>
       <w:r>
@@ -1662,109 +1733,6 @@
       </w:pPr>
     </w:lvl>
   </w:abstractNum>
-  <w:abstractNum w:abstractNumId="991">
-    <w:nsid w:val="0000A991"/>
-    <w:multiLevelType w:val="multilevel"/>
-    <w:lvl w:ilvl="0">
-      <w:numFmt w:val="bullet"/>
-      <w:lvlText w:val=""/>
-      <w:lvlJc w:val="left"/>
-      <w:pPr>
-        <w:ind w:left="720" w:hanging="360"/>
-      </w:pPr>
-      <w:rPr>
-        <w:rFonts w:ascii="Symbol" w:hAnsi="Symbol" w:cs="Symbol" w:hint="default"/>
-      </w:rPr>
-    </w:lvl>
-    <w:lvl w:ilvl="1">
-      <w:numFmt w:val="bullet"/>
-      <w:lvlText w:val="o"/>
-      <w:lvlJc w:val="left"/>
-      <w:pPr>
-        <w:ind w:left="1440" w:hanging="360"/>
-      </w:pPr>
-      <w:rPr>
-        <w:rFonts w:ascii="Courier New" w:hAnsi="Courier New" w:cs="Courier New" w:hint="default"/>
-      </w:rPr>
-    </w:lvl>
-    <w:lvl w:ilvl="2">
-      <w:numFmt w:val="bullet"/>
-      <w:lvlText w:val=""/>
-      <w:lvlJc w:val="left"/>
-      <w:pPr>
-        <w:ind w:left="2160" w:hanging="360"/>
-      </w:pPr>
-      <w:rPr>
-        <w:rFonts w:ascii="Wingdings" w:hAnsi="Wingdings" w:cs="Wingdings" w:hint="default"/>
-      </w:rPr>
-    </w:lvl>
-    <w:lvl w:ilvl="3">
-      <w:numFmt w:val="bullet"/>
-      <w:lvlText w:val=""/>
-      <w:lvlJc w:val="left"/>
-      <w:pPr>
-        <w:ind w:left="2880" w:hanging="360"/>
-      </w:pPr>
-      <w:rPr>
-        <w:rFonts w:ascii="Symbol" w:hAnsi="Symbol" w:cs="Symbol" w:hint="default"/>
-      </w:rPr>
-    </w:lvl>
-    <w:lvl w:ilvl="4">
-      <w:numFmt w:val="bullet"/>
-      <w:lvlText w:val="o"/>
-      <w:lvlJc w:val="left"/>
-      <w:pPr>
-        <w:ind w:left="3600" w:hanging="360"/>
-      </w:pPr>
-      <w:rPr>
-        <w:rFonts w:ascii="Courier New" w:hAnsi="Courier New" w:cs="Courier New" w:hint="default"/>
-      </w:rPr>
-    </w:lvl>
-    <w:lvl w:ilvl="5">
-      <w:numFmt w:val="bullet"/>
-      <w:lvlText w:val=""/>
-      <w:lvlJc w:val="left"/>
-      <w:pPr>
-        <w:ind w:left="4320" w:hanging="360"/>
-      </w:pPr>
-      <w:rPr>
-        <w:rFonts w:ascii="Wingdings" w:hAnsi="Wingdings" w:cs="Wingdings" w:hint="default"/>
-      </w:rPr>
-    </w:lvl>
-    <w:lvl w:ilvl="6">
-      <w:numFmt w:val="bullet"/>
-      <w:lvlText w:val=""/>
-      <w:lvlJc w:val="left"/>
-      <w:pPr>
-        <w:ind w:left="5040" w:hanging="360"/>
-      </w:pPr>
-      <w:rPr>
-        <w:rFonts w:ascii="Symbol" w:hAnsi="Symbol" w:cs="Symbol" w:hint="default"/>
-      </w:rPr>
-    </w:lvl>
-    <w:lvl w:ilvl="7">
-      <w:numFmt w:val="bullet"/>
-      <w:lvlText w:val="o"/>
-      <w:lvlJc w:val="left"/>
-      <w:pPr>
-        <w:ind w:left="5760" w:hanging="360"/>
-      </w:pPr>
-      <w:rPr>
-        <w:rFonts w:ascii="Courier New" w:hAnsi="Courier New" w:cs="Courier New" w:hint="default"/>
-      </w:rPr>
-    </w:lvl>
-    <w:lvl w:ilvl="8">
-      <w:numFmt w:val="bullet"/>
-      <w:lvlText w:val=""/>
-      <w:lvlJc w:val="left"/>
-      <w:pPr>
-        <w:ind w:left="6480" w:hanging="360"/>
-      </w:pPr>
-      <w:rPr>
-        <w:rFonts w:ascii="Wingdings" w:hAnsi="Wingdings" w:cs="Wingdings" w:hint="default"/>
-      </w:rPr>
-    </w:lvl>
-  </w:abstractNum>
   <w:num w:numId="1000">
     <w:abstractNumId w:val="990"/>
   </w:num>
@@ -1799,7 +1767,34 @@
     </w:lvlOverride>
   </w:num>
   <w:num w:numId="1002">
-    <w:abstractNumId w:val="991"/>
+    <w:abstractNumId w:val="99411"/>
+    <w:lvlOverride w:ilvl="0">
+      <w:startOverride w:val="1"/>
+    </w:lvlOverride>
+    <w:lvlOverride w:ilvl="1">
+      <w:startOverride w:val="1"/>
+    </w:lvlOverride>
+    <w:lvlOverride w:ilvl="2">
+      <w:startOverride w:val="1"/>
+    </w:lvlOverride>
+    <w:lvlOverride w:ilvl="3">
+      <w:startOverride w:val="1"/>
+    </w:lvlOverride>
+    <w:lvlOverride w:ilvl="4">
+      <w:startOverride w:val="1"/>
+    </w:lvlOverride>
+    <w:lvlOverride w:ilvl="5">
+      <w:startOverride w:val="1"/>
+    </w:lvlOverride>
+    <w:lvlOverride w:ilvl="6">
+      <w:startOverride w:val="1"/>
+    </w:lvlOverride>
+    <w:lvlOverride w:ilvl="7">
+      <w:startOverride w:val="1"/>
+    </w:lvlOverride>
+    <w:lvlOverride w:ilvl="8">
+      <w:startOverride w:val="1"/>
+    </w:lvlOverride>
   </w:num>
   <w:num w:numId="1003">
     <w:abstractNumId w:val="99411"/>
@@ -1832,36 +1827,6 @@
     </w:lvlOverride>
   </w:num>
   <w:num w:numId="1004">
-    <w:abstractNumId w:val="99411"/>
-    <w:lvlOverride w:ilvl="0">
-      <w:startOverride w:val="1"/>
-    </w:lvlOverride>
-    <w:lvlOverride w:ilvl="1">
-      <w:startOverride w:val="1"/>
-    </w:lvlOverride>
-    <w:lvlOverride w:ilvl="2">
-      <w:startOverride w:val="1"/>
-    </w:lvlOverride>
-    <w:lvlOverride w:ilvl="3">
-      <w:startOverride w:val="1"/>
-    </w:lvlOverride>
-    <w:lvlOverride w:ilvl="4">
-      <w:startOverride w:val="1"/>
-    </w:lvlOverride>
-    <w:lvlOverride w:ilvl="5">
-      <w:startOverride w:val="1"/>
-    </w:lvlOverride>
-    <w:lvlOverride w:ilvl="6">
-      <w:startOverride w:val="1"/>
-    </w:lvlOverride>
-    <w:lvlOverride w:ilvl="7">
-      <w:startOverride w:val="1"/>
-    </w:lvlOverride>
-    <w:lvlOverride w:ilvl="8">
-      <w:startOverride w:val="1"/>
-    </w:lvlOverride>
-  </w:num>
-  <w:num w:numId="1005">
     <w:abstractNumId w:val="99411"/>
     <w:lvlOverride w:ilvl="0">
       <w:startOverride w:val="1"/>

</xml_diff>